<commit_message>
Auto-deploy: rebuild site (2026-09-28 18:30)
</commit_message>
<xml_diff>
--- a/docs/downloads/achim-zöfelt/تم/doc_0001.docx
+++ b/docs/downloads/achim-zöfelt/تم/doc_0001.docx
@@ -1,6 +1,6 @@
 
 <file path=word/document.xml><?xml version="1.0" encoding="utf-8"?>
-<w:document xmlns:wpc="http://schemas.microsoft.com/office/word/2010/wordprocessingCanvas" xmlns:cx="http://schemas.microsoft.com/office/drawing/2014/chartex" xmlns:cx1="http://schemas.microsoft.com/office/drawing/2015/9/8/chartex" xmlns:cx2="http://schemas.microsoft.com/office/drawing/2015/10/21/chartex" xmlns:cx3="http://schemas.microsoft.com/office/drawing/2016/5/9/chartex" xmlns:cx4="http://schemas.microsoft.com/office/drawing/2016/5/10/chartex" xmlns:cx5="http://schemas.microsoft.com/office/drawing/2016/5/11/chartex" xmlns:cx6="http://schemas.microsoft.com/office/drawing/2016/5/12/chartex" xmlns:cx7="http://schemas.microsoft.com/office/drawing/2016/5/13/chartex" xmlns:cx8="http://schemas.microsoft.com/office/drawing/2016/5/14/chartex" xmlns:mc="http://schemas.openxmlformats.org/markup-compatibility/2006" xmlns:aink="http://schemas.microsoft.com/office/drawing/2016/ink" xmlns:am3d="http://schemas.microsoft.com/office/drawing/2017/model3d" xmlns:o="urn:schemas-microsoft-com:office:office" xmlns:oel="http://schemas.microsoft.com/office/2019/extlst" xmlns:r="http://schemas.openxmlformats.org/officeDocument/2006/relationships" xmlns:m="http://schemas.openxmlformats.org/officeDocument/2006/math" xmlns:v="urn:schemas-microsoft-com:vml" xmlns:wp14="http://schemas.microsoft.com/office/word/2010/wordprocessingDrawing" xmlns:wp="http://schemas.openxmlformats.org/drawingml/2006/wordprocessingDrawing" xmlns:w10="urn:schemas-microsoft-com:office:word" xmlns:w="http://schemas.openxmlformats.org/wordprocessingml/2006/main" xmlns:w14="http://schemas.microsoft.com/office/word/2010/wordml" xmlns:w15="http://schemas.microsoft.com/office/word/2012/wordml" xmlns:w16cex="http://schemas.microsoft.com/office/word/2018/wordml/cex" xmlns:w16cid="http://schemas.microsoft.com/office/word/2016/wordml/cid" xmlns:w16="http://schemas.microsoft.com/office/word/2018/wordml" xmlns:w16du="http://schemas.microsoft.com/office/word/2023/wordml/word16du" xmlns:w16sdtdh="http://schemas.microsoft.com/office/word/2020/wordml/sdtdatahash" xmlns:w16se="http://schemas.microsoft.com/office/word/2015/wordml/symex" xmlns:wpg="http://schemas.microsoft.com/office/word/2010/wordprocessingGroup" xmlns:wpi="http://schemas.microsoft.com/office/word/2010/wordprocessingInk" xmlns:wne="http://schemas.microsoft.com/office/word/2006/wordml" xmlns:wps="http://schemas.microsoft.com/office/word/2010/wordprocessingShape" mc:Ignorable="w14 w15 w16se w16cid w16 w16cex w16sdtdh w16du wp14">
+<w:document xmlns:wpc="http://schemas.microsoft.com/office/word/2010/wordprocessingCanvas" xmlns:cx="http://schemas.microsoft.com/office/drawing/2014/chartex" xmlns:cx1="http://schemas.microsoft.com/office/drawing/2015/9/8/chartex" xmlns:cx2="http://schemas.microsoft.com/office/drawing/2015/10/21/chartex" xmlns:cx3="http://schemas.microsoft.com/office/drawing/2016/5/9/chartex" xmlns:cx4="http://schemas.microsoft.com/office/drawing/2016/5/10/chartex" xmlns:cx5="http://schemas.microsoft.com/office/drawing/2016/5/11/chartex" xmlns:cx6="http://schemas.microsoft.com/office/drawing/2016/5/12/chartex" xmlns:cx7="http://schemas.microsoft.com/office/drawing/2016/5/13/chartex" xmlns:cx8="http://schemas.microsoft.com/office/drawing/2016/5/14/chartex" xmlns:mc="http://schemas.openxmlformats.org/markup-compatibility/2006" xmlns:aink="http://schemas.microsoft.com/office/drawing/2016/ink" xmlns:am3d="http://schemas.microsoft.com/office/drawing/2017/model3d" xmlns:o="urn:schemas-microsoft-com:office:office" xmlns:oel="http://schemas.microsoft.com/office/2019/extlst" xmlns:r="http://schemas.openxmlformats.org/officeDocument/2006/relationships" xmlns:m="http://schemas.openxmlformats.org/officeDocument/2006/math" xmlns:v="urn:schemas-microsoft-com:vml" xmlns:wp14="http://schemas.microsoft.com/office/word/2010/wordprocessingDrawing" xmlns:wp="http://schemas.openxmlformats.org/drawingml/2006/wordprocessingDrawing" xmlns:w10="urn:schemas-microsoft-com:office:word" xmlns:w="http://schemas.openxmlformats.org/wordprocessingml/2006/main" xmlns:w14="http://schemas.microsoft.com/office/word/2010/wordml" xmlns:w15="http://schemas.microsoft.com/office/word/2012/wordml" xmlns:w16cex="http://schemas.microsoft.com/office/word/2018/wordml/cex" xmlns:w16cid="http://schemas.microsoft.com/office/word/2016/wordml/cid" xmlns:w16="http://schemas.microsoft.com/office/word/2018/wordml" xmlns:w16du="http://schemas.microsoft.com/office/word/2023/wordml/word16du" xmlns:w16sdtdh="http://schemas.microsoft.com/office/word/2020/wordml/sdtdatahash" xmlns:w16sdtfl="http://schemas.microsoft.com/office/word/2024/wordml/sdtformatlock" xmlns:w16se="http://schemas.microsoft.com/office/word/2015/wordml/symex" xmlns:wpg="http://schemas.microsoft.com/office/word/2010/wordprocessingGroup" xmlns:wpi="http://schemas.microsoft.com/office/word/2010/wordprocessingInk" xmlns:wne="http://schemas.microsoft.com/office/word/2006/wordml" xmlns:wps="http://schemas.microsoft.com/office/word/2010/wordprocessingShape" mc:Ignorable="w14 w15 w16se w16cid w16 w16cex w16sdtdh w16sdtfl w16du wp14">
   <w:body>
     <w:p>
       <w:pPr>
@@ -119,7 +119,15 @@
           <w:rtl/>
           <w:lang w:bidi="ar-SA"/>
         </w:rPr>
-        <w:t xml:space="preserve">عند اجتماع التلاميذ في يوحنا 20 لم يكن لدينا بعد وقت الاجتماع مباشرة </w:t>
+        <w:t xml:space="preserve">عند اجتماع التلاميذ في يوحنا 20 لم يكن </w:t>
+      </w:r>
+      <w:r>
+        <w:rPr>
+          <w:rFonts w:hint="cs"/>
+          <w:rtl/>
+          <w:lang w:bidi="ar-SA"/>
+        </w:rPr>
+        <w:t xml:space="preserve">قد حان زمن الكنيسة بعد </w:t>
       </w:r>
       <w:r>
         <w:rPr>
@@ -366,7 +374,23 @@
           <w:rtl/>
           <w:lang w:bidi="ar-SA"/>
         </w:rPr>
-        <w:t xml:space="preserve">في بطمس لم يكن هناك اجتماع ككنيسة، ومع ذلك كان المؤمن المتوحد مشغولاً بالرب في الروح </w:t>
+        <w:t xml:space="preserve">في بطمس لم يكن هناك اجتماع ككنيسة، ومع ذلك كان المؤمن </w:t>
+      </w:r>
+      <w:r>
+        <w:rPr>
+          <w:rFonts w:hint="cs"/>
+          <w:rtl/>
+          <w:lang w:bidi="ar-SA"/>
+        </w:rPr>
+        <w:t>المنفرد</w:t>
+      </w:r>
+      <w:r>
+        <w:rPr>
+          <w:rFonts w:hint="cs"/>
+          <w:rtl/>
+          <w:lang w:bidi="ar-SA"/>
+        </w:rPr>
+        <w:t xml:space="preserve"> مشغولاً بالرب في الروح </w:t>
       </w:r>
       <w:r>
         <w:rPr>
@@ -528,6 +552,7 @@
           <w:rtl/>
           <w:lang w:bidi="ar-SA"/>
         </w:rPr>
+        <w:lastRenderedPageBreak/>
         <w:t>المؤمنون المجتمعون هكذا مسؤوليتهم المحليّة هي في الربط والحلّ، والتي فوضهم</w:t>
       </w:r>
       <w:r>
@@ -564,7 +589,15 @@
           <w:rtl/>
           <w:lang w:bidi="ar-SA"/>
         </w:rPr>
-        <w:t xml:space="preserve">أحد الأحد عشر لم يكن موجودًا في </w:t>
+        <w:t>واحد من</w:t>
+      </w:r>
+      <w:r>
+        <w:rPr>
+          <w:rFonts w:hint="cs"/>
+          <w:rtl/>
+          <w:lang w:bidi="ar-SA"/>
+        </w:rPr>
+        <w:t xml:space="preserve"> الأحد عشر لم يكن موجودًا في </w:t>
       </w:r>
       <w:r>
         <w:rPr>
@@ -681,23 +714,7 @@
           <w:rtl/>
           <w:lang w:bidi="ar-SA"/>
         </w:rPr>
-        <w:t>فو</w:t>
-      </w:r>
-      <w:r>
-        <w:rPr>
-          <w:rFonts w:hint="cs"/>
-          <w:rtl/>
-          <w:lang w:bidi="ar-SA"/>
-        </w:rPr>
-        <w:t>ت</w:t>
-      </w:r>
-      <w:r>
-        <w:rPr>
-          <w:rFonts w:hint="cs"/>
-          <w:rtl/>
-          <w:lang w:bidi="ar-SA"/>
-        </w:rPr>
-        <w:t>وه</w:t>
+        <w:t>فوتوه</w:t>
       </w:r>
       <w:r>
         <w:rPr>
@@ -745,7 +762,23 @@
           <w:rtl/>
           <w:lang w:bidi="ar-SA"/>
         </w:rPr>
-        <w:t>فليس من الضرورة أن تكون أمور سيئة التي نفضلها عليه. وماذا عن التزامنا بوظيفتنا في العمل؟ أفلا ننجح فعلاً بأن ننظم مواعيد عملنا بحيث يتفرغ لنا وقت للاجتماعات ككنيسة؟ كيف يختبر أولادنا وأحفادنا معنى وأهمية الاجتماع ككنيسة مع الرب في وسطنا؟ أما زالوا يرون الأوليات الصحيحة لدينا؟</w:t>
+        <w:t>فليس من الضرورة أن</w:t>
+      </w:r>
+      <w:r>
+        <w:rPr>
+          <w:rFonts w:hint="cs"/>
+          <w:rtl/>
+          <w:lang w:bidi="ar-SA"/>
+        </w:rPr>
+        <w:t>ها</w:t>
+      </w:r>
+      <w:r>
+        <w:rPr>
+          <w:rFonts w:hint="cs"/>
+          <w:rtl/>
+          <w:lang w:bidi="ar-SA"/>
+        </w:rPr>
+        <w:t xml:space="preserve"> أمور سيئة التي نفضلها عليه. وماذا عن التزامنا بوظيفتنا في العمل؟ أفلا ننجح فعلاً بأن ننظم مواعيد عملنا بحيث يتفرغ لنا وقت للاجتماعات ككنيسة؟ كيف يختبر أولادنا وأحفادنا معنى وأهمية الاجتماع ككنيسة مع الرب في وسطنا؟ أما زالوا يرون الأوليات الصحيحة لدينا؟</w:t>
       </w:r>
     </w:p>
     <w:p>
@@ -868,6 +901,7 @@
           <w:rtl/>
           <w:lang w:bidi="ar-SA"/>
         </w:rPr>
+        <w:lastRenderedPageBreak/>
         <w:t>ويُفترض بأن الأخوة في ذلك الوقت لم يكن بإمكانهم الاجتماع مثلنا في أيامنا صباح يوم الأحد، وإنما فق</w:t>
       </w:r>
       <w:r>
@@ -892,7 +926,46 @@
           <w:rtl/>
           <w:lang w:bidi="ar-SA"/>
         </w:rPr>
-        <w:t>أنه كان يجلس في الطرف، عند النافذة. ربما كان تعبًا من عمله في النهار وغرق في نومه. غير أن هذا الخبر من روح الله لم يُرِ أي شيء يُتهم به أفتيخوس. مَ</w:t>
+        <w:t>أنه كان يجلس في الطرف</w:t>
+      </w:r>
+      <w:r>
+        <w:rPr>
+          <w:rFonts w:hint="cs"/>
+          <w:rtl/>
+          <w:lang w:bidi="ar-SA"/>
+        </w:rPr>
+        <w:t xml:space="preserve"> بعيدًا</w:t>
+      </w:r>
+      <w:r>
+        <w:rPr>
+          <w:rFonts w:hint="cs"/>
+          <w:rtl/>
+          <w:lang w:bidi="ar-SA"/>
+        </w:rPr>
+        <w:t>، عند النافذة. ربما كان تعبًا من عمله في النهار وغرق في نومه. غير أن هذا الخبر من روح الله لم يُرِ أي شيء يُتهم أفتيخوس</w:t>
+      </w:r>
+      <w:r>
+        <w:rPr>
+          <w:rFonts w:hint="cs"/>
+          <w:rtl/>
+          <w:lang w:bidi="ar-SA"/>
+        </w:rPr>
+        <w:t xml:space="preserve"> </w:t>
+      </w:r>
+      <w:r>
+        <w:rPr>
+          <w:rtl/>
+          <w:lang w:bidi="ar-SA"/>
+        </w:rPr>
+        <w:t>به</w:t>
+      </w:r>
+      <w:r>
+        <w:rPr>
+          <w:rFonts w:hint="cs"/>
+          <w:rtl/>
+          <w:lang w:bidi="ar-SA"/>
+        </w:rPr>
+        <w:t>. مَ</w:t>
       </w:r>
       <w:r>
         <w:rPr>
@@ -939,7 +1012,23 @@
           <w:rtl/>
           <w:lang w:bidi="ar-SA"/>
         </w:rPr>
-        <w:t xml:space="preserve">غير أننا من الممكن أن نطبق على أنفسنا أمور ملفتة في هذا الخبر. أفتيخوس كان جالسًا هناك عند النافذة على الحد لا هو في الداخل أو الخارج، ما بين الضوء والعتمة، ما بين الدفء والبرودة. </w:t>
+        <w:t>غير أننا من الممكن أن نطبق على أنفسنا أمور</w:t>
+      </w:r>
+      <w:r>
+        <w:rPr>
+          <w:rFonts w:hint="cs"/>
+          <w:rtl/>
+          <w:lang w:bidi="ar-SA"/>
+        </w:rPr>
+        <w:t>ًا</w:t>
+      </w:r>
+      <w:r>
+        <w:rPr>
+          <w:rFonts w:hint="cs"/>
+          <w:rtl/>
+          <w:lang w:bidi="ar-SA"/>
+        </w:rPr>
+        <w:t xml:space="preserve"> ملفتة في هذا الخبر. أفتيخوس كان جالسًا هناك عند النافذة على الحد لا هو في الداخل أو الخارج، ما بين الضوء والعتمة، ما بين الدفء والبرودة. </w:t>
       </w:r>
       <w:r>
         <w:rPr>
@@ -1259,6 +1348,7 @@
           <w:rtl/>
           <w:lang w:bidi="ar-SA"/>
         </w:rPr>
+        <w:lastRenderedPageBreak/>
         <w:t>في هذا الحدث هنالك طريقة مختلفة متميزة عن التعبير عن يوم الأحد: إنه اليوم الخاص بالرب (رؤيا 1: 10 مع الملاحظة). هذه الصورة في التعبير نجدها في العهد الجديد فقط في السياق مع كسر الخبز، عندما دُعي في 1. كورنثوس 11: 29 بعشاء الرب، إنه العشاء الخاص بالرب.</w:t>
       </w:r>
     </w:p>
@@ -1354,7 +1444,23 @@
           <w:rtl/>
           <w:lang w:bidi="ar-SA"/>
         </w:rPr>
-        <w:t xml:space="preserve">يوحنا كان قد وصل في نهاية حياته الطويلة إلى جزيرة بطمس، صحيح أنه كان منفيًا هاك، كما يخبرنا مختلف الآباء الكنسيين. لا بد وأنه كان رجلاً ذات عواطف روحية عميقة. هنا وعلى هذه الجزيرة </w:t>
+        <w:t>يوحنا كان قد وصل في نهاية حياته الطويلة إلى جزيرة بطمس، صحيح أنه كان منفيًا ه</w:t>
+      </w:r>
+      <w:r>
+        <w:rPr>
+          <w:rFonts w:hint="cs"/>
+          <w:rtl/>
+          <w:lang w:bidi="ar-SA"/>
+        </w:rPr>
+        <w:t>ن</w:t>
+      </w:r>
+      <w:r>
+        <w:rPr>
+          <w:rFonts w:hint="cs"/>
+          <w:rtl/>
+          <w:lang w:bidi="ar-SA"/>
+        </w:rPr>
+        <w:t xml:space="preserve">اك، كما يخبرنا مختلف الآباء الكنسيين. لا بد وأنه كان رجلاً ذات عواطف روحية عميقة. هنا وعلى هذه الجزيرة </w:t>
       </w:r>
       <w:r>
         <w:rPr>
@@ -1384,23 +1490,55 @@
           <w:rtl/>
           <w:lang w:bidi="ar-SA"/>
         </w:rPr>
-        <w:t xml:space="preserve"> كتب في نهاية حياته بإرشاد من الروح القدس إنجيله، الذي  قدّم فيه الرب يسوع كابن الله، كما والثلاث رسائل أيضًا وسفر الرؤيا.</w:t>
-      </w:r>
-    </w:p>
-    <w:p>
-      <w:pPr>
-        <w:rPr>
-          <w:rtl/>
-          <w:lang w:bidi="ar-SA"/>
-        </w:rPr>
-      </w:pPr>
-      <w:r>
-        <w:rPr>
-          <w:rFonts w:hint="cs"/>
-          <w:rtl/>
-          <w:lang w:bidi="ar-SA"/>
-        </w:rPr>
-        <w:t>لقد اختبر يوم الأحد الأول في يوحنا 20 الذي كنا قد تأملنا. وقد كان أيضًا في يوم أحد يوم الخمسين في أورشليم، حينما كان الجميع مجتمعين معًا في مكان واحد (أعمال ال رسل 2: 1) وقد حلّ الروح القدس كشخص إلهي على كل واحد منهم. منذ ذلك الأحد سكن الروح القدس في المؤمن الحقيقي كما وأيضًا في الكنيسة كمجموعة معًا. وكان قد اختبر الكثير من أيام الأحد الأخرى في أورشليم في شركة مغبوطة مع الأخوة هناك، كما وحتى قد اعتُبر كأحد أعمدة الكنيسة هناك</w:t>
+        <w:t xml:space="preserve"> كتب في نهاية حياته بإرشاد من الروح القدس إنجيله، </w:t>
+      </w:r>
+      <w:r>
+        <w:rPr>
+          <w:rFonts w:hint="cs"/>
+          <w:rtl/>
+          <w:lang w:bidi="ar-SA"/>
+        </w:rPr>
+        <w:t>الذي قدّم</w:t>
+      </w:r>
+      <w:r>
+        <w:rPr>
+          <w:rFonts w:hint="cs"/>
+          <w:rtl/>
+          <w:lang w:bidi="ar-SA"/>
+        </w:rPr>
+        <w:t xml:space="preserve"> فيه الرب يسوع كابن الله، كما والثلاث رسائل أيضًا وسفر الرؤيا.</w:t>
+      </w:r>
+    </w:p>
+    <w:p>
+      <w:pPr>
+        <w:rPr>
+          <w:rtl/>
+          <w:lang w:bidi="ar-SA"/>
+        </w:rPr>
+      </w:pPr>
+      <w:r>
+        <w:rPr>
+          <w:rFonts w:hint="cs"/>
+          <w:rtl/>
+          <w:lang w:bidi="ar-SA"/>
+        </w:rPr>
+        <w:t>لقد اختبر يوم الأحد الأول في يوحنا 20 الذي كنا قد تأملنا</w:t>
+      </w:r>
+      <w:r>
+        <w:rPr>
+          <w:rFonts w:hint="cs"/>
+          <w:rtl/>
+          <w:lang w:bidi="ar-SA"/>
+        </w:rPr>
+        <w:t>ه</w:t>
+      </w:r>
+      <w:r>
+        <w:rPr>
+          <w:rFonts w:hint="cs"/>
+          <w:rtl/>
+          <w:lang w:bidi="ar-SA"/>
+        </w:rPr>
+        <w:t>. وقد كان أيضًا في يوم أحد يوم الخمسين في أورشليم، حينما كان الجميع مجتمعين معًا في مكان واحد (أعمال ال رسل 2: 1) وقد حلّ الروح القدس كشخص إلهي على كل واحد منهم. منذ ذلك الأحد سكن الروح القدس في المؤمن الحقيقي كما وأيضًا في الكنيسة كمجموعة معًا. وكان قد اختبر الكثير من أيام الأحد الأخرى في أورشليم في شركة مغبوطة مع الأخوة هناك، كما وحتى قد اعتُبر كأحد أعمدة الكنيسة هناك</w:t>
       </w:r>
       <w:r>
         <w:rPr>
@@ -1455,6 +1593,7 @@
           <w:rtl/>
           <w:lang w:bidi="ar-SA"/>
         </w:rPr>
+        <w:lastRenderedPageBreak/>
         <w:t xml:space="preserve">هذه الاختبارات </w:t>
       </w:r>
       <w:r>
@@ -1671,7 +1810,7 @@
 </file>
 
 <file path=word/numbering.xml><?xml version="1.0" encoding="utf-8"?>
-<w:numbering xmlns:wpc="http://schemas.microsoft.com/office/word/2010/wordprocessingCanvas" xmlns:cx="http://schemas.microsoft.com/office/drawing/2014/chartex" xmlns:cx1="http://schemas.microsoft.com/office/drawing/2015/9/8/chartex" xmlns:cx2="http://schemas.microsoft.com/office/drawing/2015/10/21/chartex" xmlns:cx3="http://schemas.microsoft.com/office/drawing/2016/5/9/chartex" xmlns:cx4="http://schemas.microsoft.com/office/drawing/2016/5/10/chartex" xmlns:cx5="http://schemas.microsoft.com/office/drawing/2016/5/11/chartex" xmlns:cx6="http://schemas.microsoft.com/office/drawing/2016/5/12/chartex" xmlns:cx7="http://schemas.microsoft.com/office/drawing/2016/5/13/chartex" xmlns:cx8="http://schemas.microsoft.com/office/drawing/2016/5/14/chartex" xmlns:mc="http://schemas.openxmlformats.org/markup-compatibility/2006" xmlns:aink="http://schemas.microsoft.com/office/drawing/2016/ink" xmlns:am3d="http://schemas.microsoft.com/office/drawing/2017/model3d" xmlns:o="urn:schemas-microsoft-com:office:office" xmlns:oel="http://schemas.microsoft.com/office/2019/extlst" xmlns:r="http://schemas.openxmlformats.org/officeDocument/2006/relationships" xmlns:m="http://schemas.openxmlformats.org/officeDocument/2006/math" xmlns:v="urn:schemas-microsoft-com:vml" xmlns:wp14="http://schemas.microsoft.com/office/word/2010/wordprocessingDrawing" xmlns:wp="http://schemas.openxmlformats.org/drawingml/2006/wordprocessingDrawing" xmlns:w10="urn:schemas-microsoft-com:office:word" xmlns:w="http://schemas.openxmlformats.org/wordprocessingml/2006/main" xmlns:w14="http://schemas.microsoft.com/office/word/2010/wordml" xmlns:w15="http://schemas.microsoft.com/office/word/2012/wordml" xmlns:w16cex="http://schemas.microsoft.com/office/word/2018/wordml/cex" xmlns:w16cid="http://schemas.microsoft.com/office/word/2016/wordml/cid" xmlns:w16="http://schemas.microsoft.com/office/word/2018/wordml" xmlns:w16du="http://schemas.microsoft.com/office/word/2023/wordml/word16du" xmlns:w16sdtdh="http://schemas.microsoft.com/office/word/2020/wordml/sdtdatahash" xmlns:w16se="http://schemas.microsoft.com/office/word/2015/wordml/symex" xmlns:wpg="http://schemas.microsoft.com/office/word/2010/wordprocessingGroup" xmlns:wpi="http://schemas.microsoft.com/office/word/2010/wordprocessingInk" xmlns:wne="http://schemas.microsoft.com/office/word/2006/wordml" xmlns:wps="http://schemas.microsoft.com/office/word/2010/wordprocessingShape" mc:Ignorable="w14 w15 w16se w16cid w16 w16cex w16sdtdh w16du wp14">
+<w:numbering xmlns:wpc="http://schemas.microsoft.com/office/word/2010/wordprocessingCanvas" xmlns:cx="http://schemas.microsoft.com/office/drawing/2014/chartex" xmlns:cx1="http://schemas.microsoft.com/office/drawing/2015/9/8/chartex" xmlns:cx2="http://schemas.microsoft.com/office/drawing/2015/10/21/chartex" xmlns:cx3="http://schemas.microsoft.com/office/drawing/2016/5/9/chartex" xmlns:cx4="http://schemas.microsoft.com/office/drawing/2016/5/10/chartex" xmlns:cx5="http://schemas.microsoft.com/office/drawing/2016/5/11/chartex" xmlns:cx6="http://schemas.microsoft.com/office/drawing/2016/5/12/chartex" xmlns:cx7="http://schemas.microsoft.com/office/drawing/2016/5/13/chartex" xmlns:cx8="http://schemas.microsoft.com/office/drawing/2016/5/14/chartex" xmlns:mc="http://schemas.openxmlformats.org/markup-compatibility/2006" xmlns:aink="http://schemas.microsoft.com/office/drawing/2016/ink" xmlns:am3d="http://schemas.microsoft.com/office/drawing/2017/model3d" xmlns:o="urn:schemas-microsoft-com:office:office" xmlns:oel="http://schemas.microsoft.com/office/2019/extlst" xmlns:r="http://schemas.openxmlformats.org/officeDocument/2006/relationships" xmlns:m="http://schemas.openxmlformats.org/officeDocument/2006/math" xmlns:v="urn:schemas-microsoft-com:vml" xmlns:wp14="http://schemas.microsoft.com/office/word/2010/wordprocessingDrawing" xmlns:wp="http://schemas.openxmlformats.org/drawingml/2006/wordprocessingDrawing" xmlns:w10="urn:schemas-microsoft-com:office:word" xmlns:w="http://schemas.openxmlformats.org/wordprocessingml/2006/main" xmlns:w14="http://schemas.microsoft.com/office/word/2010/wordml" xmlns:w15="http://schemas.microsoft.com/office/word/2012/wordml" xmlns:w16cex="http://schemas.microsoft.com/office/word/2018/wordml/cex" xmlns:w16cid="http://schemas.microsoft.com/office/word/2016/wordml/cid" xmlns:w16="http://schemas.microsoft.com/office/word/2018/wordml" xmlns:w16du="http://schemas.microsoft.com/office/word/2023/wordml/word16du" xmlns:w16sdtdh="http://schemas.microsoft.com/office/word/2020/wordml/sdtdatahash" xmlns:w16sdtfl="http://schemas.microsoft.com/office/word/2024/wordml/sdtformatlock" xmlns:w16se="http://schemas.microsoft.com/office/word/2015/wordml/symex" xmlns:wpg="http://schemas.microsoft.com/office/word/2010/wordprocessingGroup" xmlns:wpi="http://schemas.microsoft.com/office/word/2010/wordprocessingInk" xmlns:wne="http://schemas.microsoft.com/office/word/2006/wordml" xmlns:wps="http://schemas.microsoft.com/office/word/2010/wordprocessingShape" mc:Ignorable="w14 w15 w16se w16cid w16 w16cex w16sdtdh w16sdtfl w16du wp14">
   <w:abstractNum w:abstractNumId="0" w15:restartNumberingAfterBreak="0">
     <w:nsid w:val="608E66EF"/>
     <w:multiLevelType w:val="hybridMultilevel"/>
@@ -1791,7 +1930,7 @@
 </file>
 
 <file path=word/styles.xml><?xml version="1.0" encoding="utf-8"?>
-<w:styles xmlns:mc="http://schemas.openxmlformats.org/markup-compatibility/2006" xmlns:r="http://schemas.openxmlformats.org/officeDocument/2006/relationships" xmlns:w="http://schemas.openxmlformats.org/wordprocessingml/2006/main" xmlns:w14="http://schemas.microsoft.com/office/word/2010/wordml" xmlns:w15="http://schemas.microsoft.com/office/word/2012/wordml" xmlns:w16cex="http://schemas.microsoft.com/office/word/2018/wordml/cex" xmlns:w16cid="http://schemas.microsoft.com/office/word/2016/wordml/cid" xmlns:w16="http://schemas.microsoft.com/office/word/2018/wordml" xmlns:w16du="http://schemas.microsoft.com/office/word/2023/wordml/word16du" xmlns:w16sdtdh="http://schemas.microsoft.com/office/word/2020/wordml/sdtdatahash" xmlns:w16se="http://schemas.microsoft.com/office/word/2015/wordml/symex" mc:Ignorable="w14 w15 w16se w16cid w16 w16cex w16sdtdh w16du">
+<w:styles xmlns:mc="http://schemas.openxmlformats.org/markup-compatibility/2006" xmlns:r="http://schemas.openxmlformats.org/officeDocument/2006/relationships" xmlns:w="http://schemas.openxmlformats.org/wordprocessingml/2006/main" xmlns:w14="http://schemas.microsoft.com/office/word/2010/wordml" xmlns:w15="http://schemas.microsoft.com/office/word/2012/wordml" xmlns:w16cex="http://schemas.microsoft.com/office/word/2018/wordml/cex" xmlns:w16cid="http://schemas.microsoft.com/office/word/2016/wordml/cid" xmlns:w16="http://schemas.microsoft.com/office/word/2018/wordml" xmlns:w16du="http://schemas.microsoft.com/office/word/2023/wordml/word16du" xmlns:w16sdtdh="http://schemas.microsoft.com/office/word/2020/wordml/sdtdatahash" xmlns:w16sdtfl="http://schemas.microsoft.com/office/word/2024/wordml/sdtformatlock" xmlns:w16se="http://schemas.microsoft.com/office/word/2015/wordml/symex" mc:Ignorable="w14 w15 w16se w16cid w16 w16cex w16sdtdh w16sdtfl w16du">
   <w:docDefaults>
     <w:rPrDefault>
       <w:rPr>
@@ -2193,7 +2332,6 @@
     <w:name w:val="Normal"/>
     <w:qFormat/>
     <w:rPr>
-      <w:noProof/>
       <w:lang w:bidi="ar-EG"/>
     </w:rPr>
   </w:style>

</xml_diff>